<commit_message>
Condense revision to 10-page Short Communication and add submission audit
- manuscript.tex/.pdf: 10-page KBS Short Communication (two figures, two
  tables, 35 references incl. 22 Elsevier/IEEE/MDPI journal articles)
- tables generated from results by budgeted_deferral/scripts/make_sc_tables.py
- submission-notes.md: compliance checklist, figure/table and reference
  verification, unresolved items, recommendation
- highlights.txt updated; README points to the current manuscript
- corrected an overstated default-dataset claim in the extended version
- v1 manuscript preserved at tag v1-short-communication

Co-Authored-By: Claude Opus 5.5 <noreply@anthropic.com>
Claude-Session: https://claude.ai/code/session_01X6nntcPtAHsyLkZ5R49Cv9
</commit_message>
<xml_diff>
--- a/manuscript_v2/manuscript_v2.docx
+++ b/manuscript_v2/manuscript_v2.docx
@@ -227,7 +227,7 @@
         <w:pStyle w:val="FirstParagraph"/>
       </w:pPr>
       <w:r>
-        <w:t xml:space="preserve">Organisations that automate decisions must decide which records a model may decide alone, where scarce human review reduces expected loss, and whether staff can absorb the review demand that governance rules make compulsory. We study these choices in a knowledge-based routing system combining a calibrated predictor, a data-quality rule base, a two-head loss estimator that learns from incomplete review logs, and an allocator that enforces review capacity and holds mandatory cases it cannot serve. Sorting solves this governance-constrained allocation exactly in feasible and overloaded regimes, and in a multi-period system the backlog does not depend on how mandatory cases are prioritised. We compare the system with published learning-to-defer surrogates, differential triage and cost-aware heuristics under matched information, rules, costs and capacity. The evaluation spans four credit datasets (one with natural missingness), nine data-quality conditions including defects invisible to validation checks, and five simulated reviewer models, over 20 corrected repeated splits. Pooled, the proposed router was the best learning-based method but 1.2% costlier than Chow’s cost-risk rule. Learned routing overtook that rule only with roughly 1,800 or more training records, and with 6,000 it beat every comparator on all splits. Quality information reduced cost mainly when missingness was informative about outcomes (1.2–3.5%), by improving estimates of automated rather than reviewer error. In a 40-day simulation with a deterioration episode, staffing determined backlog and service completion far more than routing did. Quality-triggered rules blocked most visibly degraded records but missed three-quarters of records with invisible defects.</w:t>
+        <w:t xml:space="preserve">Organisations that automate decisions must decide which records a model may decide alone, where scarce human review reduces expected loss, and whether staff can absorb the review demand that governance rules make compulsory. We study these choices in a knowledge-based routing system combining a calibrated predictor, a data-quality rule base, a two-head loss estimator that learns from incomplete review logs, and an allocator that enforces review capacity and holds mandatory cases it cannot serve. Sorting solves this governance-constrained allocation exactly in feasible and overloaded regimes, and in a multi-period system the backlog does not depend on how mandatory cases are prioritised. We compare the system with published learning-to-defer surrogates, differential triage and cost-aware heuristics under matched information, rules, costs and capacity. The evaluation spans four credit datasets (one with natural missingness), nine data-quality conditions including defects invisible to validation checks, and five simulated reviewer models, over 20 corrected repeated splits. Pooled, the proposed router was the best learning-based method but 1.2% costlier than Chow’s cost-risk rule. Learned routing overtook that rule only with roughly 1,800 or more training records, and with 6,000 it beat Chow’s rule and L2D-CE on all 20 splits. Quality information reduced cost mainly when missingness was informative about outcomes (1.2–3.5%), by improving estimates of automated rather than reviewer error. In a 40-day simulation with a deterioration episode, staffing determined backlog and service completion far more than routing did. Quality-triggered rules blocked most visibly degraded records but missed three-quarters of records with invisible defects.</w:t>
       </w:r>
     </w:p>
     <w:p>
@@ -15263,7 +15263,7 @@
         <w:pStyle w:val="BodyText"/>
       </w:pPr>
       <w:r>
-        <w:t xml:space="preserve">Per dataset, the picture is consistent with a sample-size explanation (Table 7). On the default dataset, whose gain-fitting partition contains about 6,000 records, the proposed router beat every comparator on all 20 splits: Chow by 1.10%, confidence by 1.37%, L2D-CE by 1.29% and probability-only two-head by 1.45% (all corrected p ≤ 0.003). On German (about 200 gain-fitting records) and Australian credit (about 140), it lost to Chow by 1.96% and 3.20%. Across all datasets and reviewer models, the learned methods’ disadvantage relative to Chow grows with capacity (Fig. 2). This is expected: at higher capacity more marginal records must be ranked, and noisy gain estimates matter more there.</w:t>
+        <w:t xml:space="preserve">Per dataset, the picture is consistent with a sample-size explanation (Table 7). On the default dataset, whose gain-fitting partition contains about 6,000 records, the proposed router beat Chow by 1.10%, confidence by 1.37%, L2D-CE by 1.29% and probability-only two-head by 1.45% on all 20 splits (all corrected p ≤ 0.003), and differential triage on 19 of 20; against L2D-OvA and the earlier single-head design it won 15 of 20 splits (not significant). On German (about 200 gain-fitting records) and Australian credit (about 140), it lost to Chow by 1.96% and 3.20%. Across all datasets and reviewer models, the learned methods’ disadvantage relative to Chow grows with capacity (Fig. 2). This is expected: at higher capacity more marginal records must be ranked, and noisy gain estimates matter more there.</w:t>
       </w:r>
     </w:p>
     <w:p>
@@ -24025,7 +24025,7 @@
         <w:t xml:space="preserve"> </w:t>
       </w:r>
       <w:r>
-        <w:t xml:space="preserve">Holding information, rules and costs fixed, every learned router, including the published L2D surrogates, was worse than Chow’s cost-risk rule when trained on a few hundred records. The proposed router overtook Chow at roughly 1,800 gain-fitting records (about 2,900 logged review decisions) and beat every comparator on all splits at 6,000. The pooled comparison in Table 5, in which two of three datasets are small, therefore understates what a learned router achieves at operational data volumes and overstates it for small portfolios.</w:t>
+        <w:t xml:space="preserve">Holding information, rules and costs fixed, every learned router, including the published L2D surrogates, was worse than Chow’s cost-risk rule when trained on a few hundred records. The proposed router overtook Chow at roughly 1,800 gain-fitting records (about 2,900 logged review decisions) and at 6,000 beat Chow, confidence and L2D-CE on all 20 splits. The pooled comparison in Table 5, in which two of three datasets are small, therefore understates what a learned router achieves at operational data volumes and overstates it for small portfolios.</w:t>
       </w:r>
     </w:p>
     <w:p>
@@ -24508,7 +24508,7 @@
         <w:pStyle w:val="FirstParagraph"/>
       </w:pPr>
       <w:r>
-        <w:t xml:space="preserve">This study re-examined a data-quality-aware deferral system with explicit governance rules and review capacity, against published deferral methods, under reviewer models that do not favour its representation and under defects that quality checks cannot see. The system’s allocator solves the governance-constrained routing problem exactly in both feasible and overloaded regimes, and its two-head estimator learns from incomplete review logs. It did not, however, outperform simple cost-aware routing in the pooled comparison dominated by small datasets. Its value is conditional. It outperformed all comparators when trained on several thousand records, and quality information improved it chiefly when missingness was informative about outcomes, through better estimates of automated error rather than of reviewer error. Under severe data deterioration, staffing determined backlog and service completion far more than any routing choice, and quality-triggered rules protected only against the defects they could observe. For knowledge-based decision systems used in AI governance, the practical message is to make the rule layer, the estimation layer and the capacity layer separately visible, to measure each, and to reserve learned routing for settings with sufficient review history.</w:t>
+        <w:t xml:space="preserve">This study re-examined a data-quality-aware deferral system with explicit governance rules and review capacity, against published deferral methods, under reviewer models that do not favour its representation and under defects that quality checks cannot see. The system’s allocator solves the governance-constrained routing problem exactly in both feasible and overloaded regimes, and its two-head estimator learns from incomplete review logs. It did not, however, outperform simple cost-aware routing in the pooled comparison dominated by small datasets. Its value is conditional. It outperformed cost-aware heuristics and the published L2D surrogates when trained on several thousand records, and quality information improved it chiefly when missingness was informative about outcomes, through better estimates of automated error rather than of reviewer error. Under severe data deterioration, staffing determined backlog and service completion far more than any routing choice, and quality-triggered rules protected only against the defects they could observe. For knowledge-based decision systems used in AI governance, the practical message is to make the rule layer, the estimation layer and the capacity layer separately visible, to measure each, and to reserve learned routing for settings with sufficient review history.</w:t>
       </w:r>
     </w:p>
     <w:bookmarkEnd w:id="70"/>

</xml_diff>